<commit_message>
knowleddge 7/3/2026 part 7
</commit_message>
<xml_diff>
--- a/Knowledge/3-Work knowledge/1-Software Engineering/2-General Technologies/9-Databases/5-My Source/2-SQL/2-SQL Commands - DDL/1-Intro to SQL Commands - DDL.docx
+++ b/Knowledge/3-Work knowledge/1-Software Engineering/2-General Technologies/9-Databases/5-My Source/2-SQL/2-SQL Commands - DDL/1-Intro to SQL Commands - DDL.docx
@@ -31,9 +31,13 @@
     <w:p>
       <w:pPr>
         <w:spacing w:before="240" w:after="240"/>
-      </w:pPr>
-      <w:r>
-        <w:rPr>
+        <w:rPr>
+          <w:rFonts w:ascii="Arial" w:hAnsi="Arial" w:cs="Arial"/>
+        </w:rPr>
+      </w:pPr>
+      <w:r>
+        <w:rPr>
+          <w:rFonts w:ascii="Arial" w:hAnsi="Arial" w:cs="Arial"/>
           <w:b/>
           <w:color w:val="000000"/>
           <w:sz w:val="18"/>
@@ -43,14 +47,36 @@
       </w:r>
       <w:r>
         <w:rPr>
-          <w:color w:val="000000"/>
-          <w:sz w:val="18"/>
-          <w:highlight w:val="lightGray"/>
-        </w:rPr>
-        <w:t xml:space="preserve">: Persons Table -&gt; ID Column: 1, Name_En Column: Motasem Essam] -&gt; </w:t>
-      </w:r>
-      <w:r>
-        <w:rPr>
+          <w:rFonts w:ascii="Arial" w:hAnsi="Arial" w:cs="Arial"/>
+          <w:color w:val="000000"/>
+          <w:sz w:val="18"/>
+          <w:highlight w:val="lightGray"/>
+        </w:rPr>
+        <w:t xml:space="preserve">: Persons Table -&gt; ID Column: 1, </w:t>
+      </w:r>
+      <w:proofErr w:type="spellStart"/>
+      <w:r>
+        <w:rPr>
+          <w:rFonts w:ascii="Arial" w:hAnsi="Arial" w:cs="Arial"/>
+          <w:color w:val="000000"/>
+          <w:sz w:val="18"/>
+          <w:highlight w:val="lightGray"/>
+        </w:rPr>
+        <w:t>Name_En</w:t>
+      </w:r>
+      <w:proofErr w:type="spellEnd"/>
+      <w:r>
+        <w:rPr>
+          <w:rFonts w:ascii="Arial" w:hAnsi="Arial" w:cs="Arial"/>
+          <w:color w:val="000000"/>
+          <w:sz w:val="18"/>
+          <w:highlight w:val="lightGray"/>
+        </w:rPr>
+        <w:t xml:space="preserve"> Column: Motasem Essam] -&gt; </w:t>
+      </w:r>
+      <w:r>
+        <w:rPr>
+          <w:rFonts w:ascii="Arial" w:hAnsi="Arial" w:cs="Arial"/>
           <w:b/>
           <w:color w:val="000000"/>
           <w:sz w:val="18"/>
@@ -60,6 +86,7 @@
       </w:r>
       <w:r>
         <w:rPr>
+          <w:rFonts w:ascii="Arial" w:hAnsi="Arial" w:cs="Arial"/>
           <w:color w:val="000000"/>
           <w:sz w:val="18"/>
           <w:highlight w:val="lightGray"/>
@@ -68,6 +95,7 @@
       </w:r>
       <w:r>
         <w:rPr>
+          <w:rFonts w:ascii="Arial" w:hAnsi="Arial" w:cs="Arial"/>
           <w:b/>
           <w:color w:val="000000"/>
           <w:sz w:val="18"/>
@@ -77,6 +105,7 @@
       </w:r>
       <w:r>
         <w:rPr>
+          <w:rFonts w:ascii="Arial" w:hAnsi="Arial" w:cs="Arial"/>
           <w:color w:val="000000"/>
           <w:sz w:val="18"/>
           <w:highlight w:val="lightGray"/>
@@ -150,6 +179,7 @@
       </w:pPr>
       <w:r>
         <w:rPr>
+          <w:rFonts w:ascii="Arial" w:hAnsi="Arial" w:cs="Arial"/>
           <w:b/>
           <w:color w:val="000000"/>
           <w:sz w:val="18"/>
@@ -159,14 +189,36 @@
       </w:r>
       <w:r>
         <w:rPr>
-          <w:color w:val="000000"/>
-          <w:sz w:val="18"/>
-          <w:highlight w:val="lightGray"/>
-        </w:rPr>
-        <w:t xml:space="preserve">: Persons Table -&gt; ID Column: 1, Name_En Column: Motasem Essam] -&gt; </w:t>
-      </w:r>
-      <w:r>
-        <w:rPr>
+          <w:rFonts w:ascii="Arial" w:hAnsi="Arial" w:cs="Arial"/>
+          <w:color w:val="000000"/>
+          <w:sz w:val="18"/>
+          <w:highlight w:val="lightGray"/>
+        </w:rPr>
+        <w:t xml:space="preserve">: Persons Table -&gt; ID Column: 1, </w:t>
+      </w:r>
+      <w:proofErr w:type="spellStart"/>
+      <w:r>
+        <w:rPr>
+          <w:rFonts w:ascii="Arial" w:hAnsi="Arial" w:cs="Arial"/>
+          <w:color w:val="000000"/>
+          <w:sz w:val="18"/>
+          <w:highlight w:val="lightGray"/>
+        </w:rPr>
+        <w:t>Name_En</w:t>
+      </w:r>
+      <w:proofErr w:type="spellEnd"/>
+      <w:r>
+        <w:rPr>
+          <w:rFonts w:ascii="Arial" w:hAnsi="Arial" w:cs="Arial"/>
+          <w:color w:val="000000"/>
+          <w:sz w:val="18"/>
+          <w:highlight w:val="lightGray"/>
+        </w:rPr>
+        <w:t xml:space="preserve"> Column: Motasem Essam] -&gt; </w:t>
+      </w:r>
+      <w:r>
+        <w:rPr>
+          <w:rFonts w:ascii="Arial" w:hAnsi="Arial" w:cs="Arial"/>
           <w:b/>
           <w:color w:val="000000"/>
           <w:sz w:val="18"/>
@@ -176,6 +228,7 @@
       </w:r>
       <w:r>
         <w:rPr>
+          <w:rFonts w:ascii="Arial" w:hAnsi="Arial" w:cs="Arial"/>
           <w:color w:val="000000"/>
           <w:sz w:val="18"/>
           <w:highlight w:val="lightGray"/>
@@ -184,6 +237,7 @@
       </w:r>
       <w:r>
         <w:rPr>
+          <w:rFonts w:ascii="Arial" w:hAnsi="Arial" w:cs="Arial"/>
           <w:b/>
           <w:color w:val="000000"/>
           <w:sz w:val="18"/>
@@ -193,6 +247,7 @@
       </w:r>
       <w:r>
         <w:rPr>
+          <w:rFonts w:ascii="Arial" w:hAnsi="Arial" w:cs="Arial"/>
           <w:color w:val="000000"/>
           <w:sz w:val="18"/>
           <w:highlight w:val="lightGray"/>
@@ -423,6 +478,7 @@
                 <w:b/>
                 <w:bCs/>
               </w:rPr>
+              <w:lastRenderedPageBreak/>
               <w:t>ALTER</w:t>
             </w:r>
           </w:p>
@@ -681,6 +737,7 @@
       </w:pPr>
       <w:r>
         <w:rPr>
+          <w:rFonts w:ascii="Arial" w:hAnsi="Arial" w:cs="Arial"/>
           <w:b/>
           <w:color w:val="000000"/>
           <w:sz w:val="18"/>
@@ -690,14 +747,36 @@
       </w:r>
       <w:r>
         <w:rPr>
-          <w:color w:val="000000"/>
-          <w:sz w:val="18"/>
-          <w:highlight w:val="lightGray"/>
-        </w:rPr>
-        <w:t xml:space="preserve">: Persons Table -&gt; ID Column: 1, Name_En Column: Motasem Essam] -&gt; </w:t>
-      </w:r>
-      <w:r>
-        <w:rPr>
+          <w:rFonts w:ascii="Arial" w:hAnsi="Arial" w:cs="Arial"/>
+          <w:color w:val="000000"/>
+          <w:sz w:val="18"/>
+          <w:highlight w:val="lightGray"/>
+        </w:rPr>
+        <w:t xml:space="preserve">: Persons Table -&gt; ID Column: 1, </w:t>
+      </w:r>
+      <w:proofErr w:type="spellStart"/>
+      <w:r>
+        <w:rPr>
+          <w:rFonts w:ascii="Arial" w:hAnsi="Arial" w:cs="Arial"/>
+          <w:color w:val="000000"/>
+          <w:sz w:val="18"/>
+          <w:highlight w:val="lightGray"/>
+        </w:rPr>
+        <w:t>Name_En</w:t>
+      </w:r>
+      <w:proofErr w:type="spellEnd"/>
+      <w:r>
+        <w:rPr>
+          <w:rFonts w:ascii="Arial" w:hAnsi="Arial" w:cs="Arial"/>
+          <w:color w:val="000000"/>
+          <w:sz w:val="18"/>
+          <w:highlight w:val="lightGray"/>
+        </w:rPr>
+        <w:t xml:space="preserve"> Column: Motasem Essam] -&gt; </w:t>
+      </w:r>
+      <w:r>
+        <w:rPr>
+          <w:rFonts w:ascii="Arial" w:hAnsi="Arial" w:cs="Arial"/>
           <w:b/>
           <w:color w:val="000000"/>
           <w:sz w:val="18"/>
@@ -707,6 +786,7 @@
       </w:r>
       <w:r>
         <w:rPr>
+          <w:rFonts w:ascii="Arial" w:hAnsi="Arial" w:cs="Arial"/>
           <w:color w:val="000000"/>
           <w:sz w:val="18"/>
           <w:highlight w:val="lightGray"/>
@@ -715,6 +795,7 @@
       </w:r>
       <w:r>
         <w:rPr>
+          <w:rFonts w:ascii="Arial" w:hAnsi="Arial" w:cs="Arial"/>
           <w:b/>
           <w:color w:val="000000"/>
           <w:sz w:val="18"/>
@@ -724,6 +805,7 @@
       </w:r>
       <w:r>
         <w:rPr>
+          <w:rFonts w:ascii="Arial" w:hAnsi="Arial" w:cs="Arial"/>
           <w:color w:val="000000"/>
           <w:sz w:val="18"/>
           <w:highlight w:val="lightGray"/>
@@ -831,6 +913,7 @@
         <w:rPr>
           <w:color w:val="000000"/>
         </w:rPr>
+        <w:lastRenderedPageBreak/>
         <w:t xml:space="preserve">2. </w:t>
       </w:r>
       <w:r>
@@ -847,6 +930,7 @@
       </w:pPr>
       <w:r>
         <w:rPr>
+          <w:rFonts w:ascii="Arial" w:hAnsi="Arial" w:cs="Arial"/>
           <w:b/>
           <w:color w:val="000000"/>
           <w:sz w:val="18"/>
@@ -856,14 +940,36 @@
       </w:r>
       <w:r>
         <w:rPr>
-          <w:color w:val="000000"/>
-          <w:sz w:val="18"/>
-          <w:highlight w:val="lightGray"/>
-        </w:rPr>
-        <w:t xml:space="preserve">: Persons Table -&gt; ID Column: 1, Name_En Column: Motasem Essam] -&gt; </w:t>
-      </w:r>
-      <w:r>
-        <w:rPr>
+          <w:rFonts w:ascii="Arial" w:hAnsi="Arial" w:cs="Arial"/>
+          <w:color w:val="000000"/>
+          <w:sz w:val="18"/>
+          <w:highlight w:val="lightGray"/>
+        </w:rPr>
+        <w:t xml:space="preserve">: Persons Table -&gt; ID Column: 1, </w:t>
+      </w:r>
+      <w:proofErr w:type="spellStart"/>
+      <w:r>
+        <w:rPr>
+          <w:rFonts w:ascii="Arial" w:hAnsi="Arial" w:cs="Arial"/>
+          <w:color w:val="000000"/>
+          <w:sz w:val="18"/>
+          <w:highlight w:val="lightGray"/>
+        </w:rPr>
+        <w:t>Name_En</w:t>
+      </w:r>
+      <w:proofErr w:type="spellEnd"/>
+      <w:r>
+        <w:rPr>
+          <w:rFonts w:ascii="Arial" w:hAnsi="Arial" w:cs="Arial"/>
+          <w:color w:val="000000"/>
+          <w:sz w:val="18"/>
+          <w:highlight w:val="lightGray"/>
+        </w:rPr>
+        <w:t xml:space="preserve"> Column: Motasem Essam] -&gt; </w:t>
+      </w:r>
+      <w:r>
+        <w:rPr>
+          <w:rFonts w:ascii="Arial" w:hAnsi="Arial" w:cs="Arial"/>
           <w:b/>
           <w:color w:val="000000"/>
           <w:sz w:val="18"/>
@@ -873,6 +979,7 @@
       </w:r>
       <w:r>
         <w:rPr>
+          <w:rFonts w:ascii="Arial" w:hAnsi="Arial" w:cs="Arial"/>
           <w:color w:val="000000"/>
           <w:sz w:val="18"/>
           <w:highlight w:val="lightGray"/>
@@ -881,6 +988,7 @@
       </w:r>
       <w:r>
         <w:rPr>
+          <w:rFonts w:ascii="Arial" w:hAnsi="Arial" w:cs="Arial"/>
           <w:b/>
           <w:color w:val="000000"/>
           <w:sz w:val="18"/>
@@ -890,6 +998,7 @@
       </w:r>
       <w:r>
         <w:rPr>
+          <w:rFonts w:ascii="Arial" w:hAnsi="Arial" w:cs="Arial"/>
           <w:color w:val="000000"/>
           <w:sz w:val="18"/>
           <w:highlight w:val="lightGray"/>
@@ -981,6 +1090,7 @@
       </w:pPr>
       <w:r>
         <w:rPr>
+          <w:rFonts w:ascii="Arial" w:hAnsi="Arial" w:cs="Arial"/>
           <w:b/>
           <w:color w:val="000000"/>
           <w:sz w:val="18"/>
@@ -990,14 +1100,36 @@
       </w:r>
       <w:r>
         <w:rPr>
-          <w:color w:val="000000"/>
-          <w:sz w:val="18"/>
-          <w:highlight w:val="lightGray"/>
-        </w:rPr>
-        <w:t xml:space="preserve">: Persons Table -&gt; ID Column: 1, Name_En Column: Motasem Essam] -&gt; </w:t>
-      </w:r>
-      <w:r>
-        <w:rPr>
+          <w:rFonts w:ascii="Arial" w:hAnsi="Arial" w:cs="Arial"/>
+          <w:color w:val="000000"/>
+          <w:sz w:val="18"/>
+          <w:highlight w:val="lightGray"/>
+        </w:rPr>
+        <w:t xml:space="preserve">: Persons Table -&gt; ID Column: 1, </w:t>
+      </w:r>
+      <w:proofErr w:type="spellStart"/>
+      <w:r>
+        <w:rPr>
+          <w:rFonts w:ascii="Arial" w:hAnsi="Arial" w:cs="Arial"/>
+          <w:color w:val="000000"/>
+          <w:sz w:val="18"/>
+          <w:highlight w:val="lightGray"/>
+        </w:rPr>
+        <w:t>Name_En</w:t>
+      </w:r>
+      <w:proofErr w:type="spellEnd"/>
+      <w:r>
+        <w:rPr>
+          <w:rFonts w:ascii="Arial" w:hAnsi="Arial" w:cs="Arial"/>
+          <w:color w:val="000000"/>
+          <w:sz w:val="18"/>
+          <w:highlight w:val="lightGray"/>
+        </w:rPr>
+        <w:t xml:space="preserve"> Column: Motasem Essam] -&gt; </w:t>
+      </w:r>
+      <w:r>
+        <w:rPr>
+          <w:rFonts w:ascii="Arial" w:hAnsi="Arial" w:cs="Arial"/>
           <w:b/>
           <w:color w:val="000000"/>
           <w:sz w:val="18"/>
@@ -1007,6 +1139,7 @@
       </w:r>
       <w:r>
         <w:rPr>
+          <w:rFonts w:ascii="Arial" w:hAnsi="Arial" w:cs="Arial"/>
           <w:color w:val="000000"/>
           <w:sz w:val="18"/>
           <w:highlight w:val="lightGray"/>
@@ -1015,6 +1148,7 @@
       </w:r>
       <w:r>
         <w:rPr>
+          <w:rFonts w:ascii="Arial" w:hAnsi="Arial" w:cs="Arial"/>
           <w:b/>
           <w:color w:val="000000"/>
           <w:sz w:val="18"/>
@@ -1024,6 +1158,7 @@
       </w:r>
       <w:r>
         <w:rPr>
+          <w:rFonts w:ascii="Arial" w:hAnsi="Arial" w:cs="Arial"/>
           <w:color w:val="000000"/>
           <w:sz w:val="18"/>
           <w:highlight w:val="lightGray"/>
@@ -1115,6 +1250,7 @@
       </w:pPr>
       <w:r>
         <w:rPr>
+          <w:rFonts w:ascii="Arial" w:hAnsi="Arial" w:cs="Arial"/>
           <w:b/>
           <w:color w:val="000000"/>
           <w:sz w:val="18"/>
@@ -1124,14 +1260,36 @@
       </w:r>
       <w:r>
         <w:rPr>
-          <w:color w:val="000000"/>
-          <w:sz w:val="18"/>
-          <w:highlight w:val="lightGray"/>
-        </w:rPr>
-        <w:t xml:space="preserve">: Persons Table -&gt; ID Column: 1, Name_En Column: Motasem Essam] -&gt; </w:t>
-      </w:r>
-      <w:r>
-        <w:rPr>
+          <w:rFonts w:ascii="Arial" w:hAnsi="Arial" w:cs="Arial"/>
+          <w:color w:val="000000"/>
+          <w:sz w:val="18"/>
+          <w:highlight w:val="lightGray"/>
+        </w:rPr>
+        <w:t xml:space="preserve">: Persons Table -&gt; ID Column: 1, </w:t>
+      </w:r>
+      <w:proofErr w:type="spellStart"/>
+      <w:r>
+        <w:rPr>
+          <w:rFonts w:ascii="Arial" w:hAnsi="Arial" w:cs="Arial"/>
+          <w:color w:val="000000"/>
+          <w:sz w:val="18"/>
+          <w:highlight w:val="lightGray"/>
+        </w:rPr>
+        <w:t>Name_En</w:t>
+      </w:r>
+      <w:proofErr w:type="spellEnd"/>
+      <w:r>
+        <w:rPr>
+          <w:rFonts w:ascii="Arial" w:hAnsi="Arial" w:cs="Arial"/>
+          <w:color w:val="000000"/>
+          <w:sz w:val="18"/>
+          <w:highlight w:val="lightGray"/>
+        </w:rPr>
+        <w:t xml:space="preserve"> Column: Motasem Essam] -&gt; </w:t>
+      </w:r>
+      <w:r>
+        <w:rPr>
+          <w:rFonts w:ascii="Arial" w:hAnsi="Arial" w:cs="Arial"/>
           <w:b/>
           <w:color w:val="000000"/>
           <w:sz w:val="18"/>
@@ -1141,6 +1299,7 @@
       </w:r>
       <w:r>
         <w:rPr>
+          <w:rFonts w:ascii="Arial" w:hAnsi="Arial" w:cs="Arial"/>
           <w:color w:val="000000"/>
           <w:sz w:val="18"/>
           <w:highlight w:val="lightGray"/>
@@ -1149,6 +1308,7 @@
       </w:r>
       <w:r>
         <w:rPr>
+          <w:rFonts w:ascii="Arial" w:hAnsi="Arial" w:cs="Arial"/>
           <w:b/>
           <w:color w:val="000000"/>
           <w:sz w:val="18"/>
@@ -1158,6 +1318,7 @@
       </w:r>
       <w:r>
         <w:rPr>
+          <w:rFonts w:ascii="Arial" w:hAnsi="Arial" w:cs="Arial"/>
           <w:color w:val="000000"/>
           <w:sz w:val="18"/>
           <w:highlight w:val="lightGray"/>
@@ -1249,23 +1410,47 @@
       </w:pPr>
       <w:r>
         <w:rPr>
+          <w:rFonts w:ascii="Arial" w:hAnsi="Arial" w:cs="Arial"/>
           <w:b/>
           <w:color w:val="000000"/>
           <w:sz w:val="18"/>
           <w:highlight w:val="lightGray"/>
         </w:rPr>
+        <w:lastRenderedPageBreak/>
         <w:t># Source: AI Source: Provided by: [Data Path</w:t>
       </w:r>
       <w:r>
         <w:rPr>
-          <w:color w:val="000000"/>
-          <w:sz w:val="18"/>
-          <w:highlight w:val="lightGray"/>
-        </w:rPr>
-        <w:t xml:space="preserve">: Persons Table -&gt; ID Column: 1, Name_En Column: Motasem Essam] -&gt; </w:t>
-      </w:r>
-      <w:r>
-        <w:rPr>
+          <w:rFonts w:ascii="Arial" w:hAnsi="Arial" w:cs="Arial"/>
+          <w:color w:val="000000"/>
+          <w:sz w:val="18"/>
+          <w:highlight w:val="lightGray"/>
+        </w:rPr>
+        <w:t xml:space="preserve">: Persons Table -&gt; ID Column: 1, </w:t>
+      </w:r>
+      <w:proofErr w:type="spellStart"/>
+      <w:r>
+        <w:rPr>
+          <w:rFonts w:ascii="Arial" w:hAnsi="Arial" w:cs="Arial"/>
+          <w:color w:val="000000"/>
+          <w:sz w:val="18"/>
+          <w:highlight w:val="lightGray"/>
+        </w:rPr>
+        <w:t>Name_En</w:t>
+      </w:r>
+      <w:proofErr w:type="spellEnd"/>
+      <w:r>
+        <w:rPr>
+          <w:rFonts w:ascii="Arial" w:hAnsi="Arial" w:cs="Arial"/>
+          <w:color w:val="000000"/>
+          <w:sz w:val="18"/>
+          <w:highlight w:val="lightGray"/>
+        </w:rPr>
+        <w:t xml:space="preserve"> Column: Motasem Essam] -&gt; </w:t>
+      </w:r>
+      <w:r>
+        <w:rPr>
+          <w:rFonts w:ascii="Arial" w:hAnsi="Arial" w:cs="Arial"/>
           <w:b/>
           <w:color w:val="000000"/>
           <w:sz w:val="18"/>
@@ -1275,6 +1460,7 @@
       </w:r>
       <w:r>
         <w:rPr>
+          <w:rFonts w:ascii="Arial" w:hAnsi="Arial" w:cs="Arial"/>
           <w:color w:val="000000"/>
           <w:sz w:val="18"/>
           <w:highlight w:val="lightGray"/>
@@ -1283,6 +1469,7 @@
       </w:r>
       <w:r>
         <w:rPr>
+          <w:rFonts w:ascii="Arial" w:hAnsi="Arial" w:cs="Arial"/>
           <w:b/>
           <w:color w:val="000000"/>
           <w:sz w:val="18"/>
@@ -1292,6 +1479,7 @@
       </w:r>
       <w:r>
         <w:rPr>
+          <w:rFonts w:ascii="Arial" w:hAnsi="Arial" w:cs="Arial"/>
           <w:color w:val="000000"/>
           <w:sz w:val="18"/>
           <w:highlight w:val="lightGray"/>
@@ -1379,6 +1567,7 @@
       </w:pPr>
       <w:r>
         <w:rPr>
+          <w:rFonts w:ascii="Arial" w:hAnsi="Arial" w:cs="Arial"/>
           <w:b/>
           <w:color w:val="000000"/>
           <w:sz w:val="18"/>
@@ -1388,14 +1577,36 @@
       </w:r>
       <w:r>
         <w:rPr>
-          <w:color w:val="000000"/>
-          <w:sz w:val="18"/>
-          <w:highlight w:val="lightGray"/>
-        </w:rPr>
-        <w:t xml:space="preserve">: Persons Table -&gt; ID Column: 1, Name_En Column: Motasem Essam] -&gt; </w:t>
-      </w:r>
-      <w:r>
-        <w:rPr>
+          <w:rFonts w:ascii="Arial" w:hAnsi="Arial" w:cs="Arial"/>
+          <w:color w:val="000000"/>
+          <w:sz w:val="18"/>
+          <w:highlight w:val="lightGray"/>
+        </w:rPr>
+        <w:t xml:space="preserve">: Persons Table -&gt; ID Column: 1, </w:t>
+      </w:r>
+      <w:proofErr w:type="spellStart"/>
+      <w:r>
+        <w:rPr>
+          <w:rFonts w:ascii="Arial" w:hAnsi="Arial" w:cs="Arial"/>
+          <w:color w:val="000000"/>
+          <w:sz w:val="18"/>
+          <w:highlight w:val="lightGray"/>
+        </w:rPr>
+        <w:t>Name_En</w:t>
+      </w:r>
+      <w:proofErr w:type="spellEnd"/>
+      <w:r>
+        <w:rPr>
+          <w:rFonts w:ascii="Arial" w:hAnsi="Arial" w:cs="Arial"/>
+          <w:color w:val="000000"/>
+          <w:sz w:val="18"/>
+          <w:highlight w:val="lightGray"/>
+        </w:rPr>
+        <w:t xml:space="preserve"> Column: Motasem Essam] -&gt; </w:t>
+      </w:r>
+      <w:r>
+        <w:rPr>
+          <w:rFonts w:ascii="Arial" w:hAnsi="Arial" w:cs="Arial"/>
           <w:b/>
           <w:color w:val="000000"/>
           <w:sz w:val="18"/>
@@ -1405,6 +1616,7 @@
       </w:r>
       <w:r>
         <w:rPr>
+          <w:rFonts w:ascii="Arial" w:hAnsi="Arial" w:cs="Arial"/>
           <w:color w:val="000000"/>
           <w:sz w:val="18"/>
           <w:highlight w:val="lightGray"/>
@@ -1413,6 +1625,7 @@
       </w:r>
       <w:r>
         <w:rPr>
+          <w:rFonts w:ascii="Arial" w:hAnsi="Arial" w:cs="Arial"/>
           <w:b/>
           <w:color w:val="000000"/>
           <w:sz w:val="18"/>
@@ -1422,6 +1635,7 @@
       </w:r>
       <w:r>
         <w:rPr>
+          <w:rFonts w:ascii="Arial" w:hAnsi="Arial" w:cs="Arial"/>
           <w:color w:val="000000"/>
           <w:sz w:val="18"/>
           <w:highlight w:val="lightGray"/>

</xml_diff>